<commit_message>
Keep worksheet identity fields on one line and expose CI diagnostics
</commit_message>
<xml_diff>
--- a/paperwork/generated/WS1_answers.docx
+++ b/paperwork/generated/WS1_answers.docx
@@ -26,62 +26,16 @@
     </w:p>
     <w:p>
       <w:pPr>
-        <w:spacing w:after="40" w:before="0"/>
+        <w:spacing w:line="288" w:lineRule="auto" w:after="40" w:before="0"/>
         <w:rPr>
           <w:lang w:eastAsia="zh-TW"/>
         </w:rPr>
       </w:pPr>
       <w:r>
         <w:rPr>
-          <w:sz w:val="22"/>
-          <w:lang w:eastAsia="zh-TW"/>
-        </w:rPr>
-        <w:t>姓名：_____________</w:t>
-      </w:r>
-      <w:r>
-        <w:rPr>
-          <w:rFonts w:ascii="新細明體" w:eastAsia="新細明體" w:hAnsi="新細明體" w:cs="新細明體" w:hint="eastAsia"/>
-          <w:sz w:val="22"/>
-          <w:lang w:eastAsia="zh-TW"/>
-        </w:rPr>
-        <w:t>＿＿＿＿</w:t>
-      </w:r>
-      <w:r>
-        <w:rPr>
-          <w:sz w:val="22"/>
-          <w:lang w:eastAsia="zh-TW"/>
-        </w:rPr>
-        <w:t xml:space="preserve">_____　</w:t>
-      </w:r>
-      <w:r>
-        <w:rPr>
-          <w:rFonts w:ascii="新細明體" w:eastAsia="新細明體" w:hAnsi="新細明體" w:cs="新細明體" w:hint="eastAsia"/>
-          <w:sz w:val="22"/>
-          <w:lang w:eastAsia="zh-TW"/>
-        </w:rPr>
-        <w:t xml:space="preserve">　　　　　　　　　　　　　　</w:t>
-      </w:r>
-      <w:r>
-        <w:rPr>
-          <w:sz w:val="22"/>
-          <w:lang w:eastAsia="zh-TW"/>
-        </w:rPr>
-        <w:t>班別（學號）：________</w:t>
-      </w:r>
-      <w:r>
-        <w:rPr>
-          <w:rFonts w:ascii="新細明體" w:eastAsia="新細明體" w:hAnsi="新細明體" w:cs="新細明體" w:hint="eastAsia"/>
-          <w:sz w:val="22"/>
-          <w:lang w:eastAsia="zh-TW"/>
-        </w:rPr>
-        <w:t>＿＿＿</w:t>
-      </w:r>
-      <w:r>
-        <w:rPr>
-          <w:sz w:val="22"/>
-          <w:lang w:eastAsia="zh-TW"/>
-        </w:rPr>
-        <w:t>__________</w:t>
+          <w:sz w:val="24"/>
+        </w:rPr>
+        <w:t>姓名：________________　　班別：________　　學號：________</w:t>
       </w:r>
     </w:p>
     <w:p>

</xml_diff>

<commit_message>
Describe oil layer disappearance and label worksheet oil and water layers
</commit_message>
<xml_diff>
--- a/paperwork/generated/WS1_answers.docx
+++ b/paperwork/generated/WS1_answers.docx
@@ -481,7 +481,6 @@
         <w:rPr>
           <w:lang w:eastAsia="zh-TW"/>
         </w:rPr>
-        <w:lastRenderedPageBreak/>
         <w:t>部分</w:t>
       </w:r>
       <w:r>
@@ -1264,7 +1263,6 @@
         <w:rPr>
           <w:lang w:eastAsia="zh-TW"/>
         </w:rPr>
-        <w:lastRenderedPageBreak/>
         <w:t>部分</w:t>
       </w:r>
       <w:r>
@@ -1383,7 +1381,7 @@
         <w:rPr>
           <w:sz w:val="24"/>
         </w:rPr>
-        <w:t>消化液 X 最主要使脂質變成 （</w:t>
+        <w:t>加入消化液 X 後，主要觀察到 （</w:t>
       </w:r>
       <w:r>
         <w:rPr>
@@ -1398,7 +1396,7 @@
         <w:rPr>
           <w:sz w:val="24"/>
         </w:rPr>
-        <w:t xml:space="preserve"> ／ 清澈溶液）。</w:t>
+        <w:t xml:space="preserve"> ／ 油層消失）。</w:t>
       </w:r>
     </w:p>
     <w:p>
@@ -1487,7 +1485,7 @@
         <w:rPr>
           <w:lang w:eastAsia="zh-TW"/>
         </w:rPr>
-        <w:t>我們只觀察油層、混濁或清澈的外觀，沒有檢測消化產物。以下哪個說法最恰當？</w:t>
+        <w:t>我們只觀察油層是否存在及混濁程度，沒有檢測消化產物。以下哪個說法最恰當？</w:t>
       </w:r>
     </w:p>
     <w:p>
@@ -1515,7 +1513,7 @@
         <w:rPr>
           <w:lang w:eastAsia="zh-TW"/>
         </w:rPr>
-        <w:t>B. 只要混合物清澈，就已完全證明脂質分解成</w:t>
+        <w:t>B. 只要油層消失，就已完全證明脂質分解成</w:t>
       </w:r>
       <w:r>
         <w:rPr>
@@ -1558,7 +1556,6 @@
         <w:rPr>
           <w:lang w:eastAsia="zh-TW"/>
         </w:rPr>
-        <w:lastRenderedPageBreak/>
         <w:t>部分</w:t>
       </w:r>
       <w:r>

</xml_diff>

<commit_message>
Restore deductive concept-first worksheets for the paper comparison group
</commit_message>
<xml_diff>
--- a/paperwork/generated/WS1_answers.docx
+++ b/paperwork/generated/WS1_answers.docx
@@ -9,7 +9,7 @@
       </w:pPr>
       <w:r>
         <w:rPr/>
-        <w:t>工作紙一：未知消化液 X 與 Y</w:t>
+        <w:t>工作紙一：脂質消化的概念與應用</w:t>
       </w:r>
     </w:p>
     <w:p>
@@ -21,6 +21,354 @@
       </w:r>
     </w:p>
     <w:p>
+      <w:r>
+        <w:rPr>
+          <w:sz w:val="24"/>
+        </w:rPr>
+        <w:t>請先閱讀「課題需知」，再運用概念分析各組結果。</w:t>
+      </w:r>
+    </w:p>
+    <w:p>
+      <w:pPr>
+        <w:pStyle w:val="Heading1"/>
+        <w:pageBreakBefore w:val="0"/>
+      </w:pPr>
+      <w:r>
+        <w:t>課題需知</w:t>
+      </w:r>
+    </w:p>
+    <w:p>
+      <w:r>
+        <w:rPr>
+          <w:sz w:val="24"/>
+        </w:rPr>
+      </w:r>
+      <w:r>
+        <w:rPr>
+          <w:sz w:val="24"/>
+        </w:rPr>
+        <w:t>X 是</w:t>
+      </w:r>
+      <w:r>
+        <w:rPr>
+          <w:b/>
+          <w:color w:val="B7312C"/>
+          <w:sz w:val="24"/>
+        </w:rPr>
+        <w:t>膽汁</w:t>
+      </w:r>
+      <w:r>
+        <w:rPr>
+          <w:sz w:val="24"/>
+        </w:rPr>
+        <w:t>，由肝臟製造並儲存於膽囊，不含消化酶。它透過</w:t>
+      </w:r>
+      <w:r>
+        <w:rPr>
+          <w:b/>
+          <w:color w:val="B7312C"/>
+          <w:sz w:val="24"/>
+        </w:rPr>
+        <w:t>物理消化</w:t>
+      </w:r>
+      <w:r>
+        <w:rPr>
+          <w:sz w:val="24"/>
+        </w:rPr>
+        <w:t>把大油滴</w:t>
+      </w:r>
+      <w:r>
+        <w:rPr>
+          <w:b/>
+          <w:color w:val="B7312C"/>
+          <w:sz w:val="24"/>
+        </w:rPr>
+        <w:t>乳化</w:t>
+      </w:r>
+      <w:r>
+        <w:rPr>
+          <w:sz w:val="24"/>
+        </w:rPr>
+        <w:t>成小油滴，脂質分子不變；同量脂質的</w:t>
+      </w:r>
+      <w:r>
+        <w:rPr>
+          <w:b/>
+          <w:color w:val="B7312C"/>
+          <w:sz w:val="24"/>
+        </w:rPr>
+        <w:t>總表面積</w:t>
+      </w:r>
+      <w:r>
+        <w:rPr>
+          <w:sz w:val="24"/>
+        </w:rPr>
+        <w:t>增加，有助</w:t>
+      </w:r>
+      <w:r>
+        <w:rPr>
+          <w:b/>
+          <w:color w:val="B7312C"/>
+          <w:sz w:val="24"/>
+        </w:rPr>
+        <w:t>脂肪酶</w:t>
+      </w:r>
+      <w:r>
+        <w:rPr>
+          <w:sz w:val="24"/>
+        </w:rPr>
+        <w:t>接觸脂質。</w:t>
+      </w:r>
+    </w:p>
+    <w:p>
+      <w:r>
+        <w:rPr>
+          <w:sz w:val="24"/>
+        </w:rPr>
+      </w:r>
+      <w:r>
+        <w:rPr>
+          <w:sz w:val="24"/>
+        </w:rPr>
+        <w:t>Y 是</w:t>
+      </w:r>
+      <w:r>
+        <w:rPr>
+          <w:b/>
+          <w:color w:val="B7312C"/>
+          <w:sz w:val="24"/>
+        </w:rPr>
+        <w:t>胰液</w:t>
+      </w:r>
+      <w:r>
+        <w:rPr>
+          <w:sz w:val="24"/>
+        </w:rPr>
+        <w:t>，含有</w:t>
+      </w:r>
+      <w:r>
+        <w:rPr>
+          <w:b/>
+          <w:color w:val="B7312C"/>
+          <w:sz w:val="24"/>
+        </w:rPr>
+        <w:t>脂肪酶</w:t>
+      </w:r>
+      <w:r>
+        <w:rPr>
+          <w:sz w:val="24"/>
+        </w:rPr>
+        <w:t>。</w:t>
+      </w:r>
+      <w:r>
+        <w:rPr>
+          <w:b/>
+          <w:color w:val="B7312C"/>
+          <w:sz w:val="24"/>
+        </w:rPr>
+        <w:t>脂肪酶</w:t>
+      </w:r>
+      <w:r>
+        <w:rPr>
+          <w:sz w:val="24"/>
+        </w:rPr>
+        <w:t>催化</w:t>
+      </w:r>
+      <w:r>
+        <w:rPr>
+          <w:b/>
+          <w:color w:val="B7312C"/>
+          <w:sz w:val="24"/>
+        </w:rPr>
+        <w:t>化學消化</w:t>
+      </w:r>
+      <w:r>
+        <w:rPr>
+          <w:sz w:val="24"/>
+        </w:rPr>
+        <w:t>，按本課完全水解簡化模型，把脂質分解為</w:t>
+      </w:r>
+      <w:r>
+        <w:rPr>
+          <w:b/>
+          <w:color w:val="B7312C"/>
+          <w:sz w:val="24"/>
+        </w:rPr>
+        <w:t>甘油</w:t>
+      </w:r>
+      <w:r>
+        <w:rPr>
+          <w:sz w:val="24"/>
+        </w:rPr>
+        <w:t>和</w:t>
+      </w:r>
+      <w:r>
+        <w:rPr>
+          <w:b/>
+          <w:color w:val="B7312C"/>
+          <w:sz w:val="24"/>
+        </w:rPr>
+        <w:t>脂肪酸</w:t>
+      </w:r>
+      <w:r>
+        <w:rPr>
+          <w:sz w:val="24"/>
+        </w:rPr>
+        <w:t>。</w:t>
+      </w:r>
+      <w:r>
+        <w:rPr>
+          <w:b/>
+          <w:color w:val="B7312C"/>
+          <w:sz w:val="24"/>
+        </w:rPr>
+        <w:t>脂肪酶</w:t>
+      </w:r>
+      <w:r>
+        <w:rPr>
+          <w:sz w:val="24"/>
+        </w:rPr>
+        <w:t>是</w:t>
+      </w:r>
+      <w:r>
+        <w:rPr>
+          <w:b/>
+          <w:color w:val="B7312C"/>
+          <w:sz w:val="24"/>
+        </w:rPr>
+        <w:t>蛋白質</w:t>
+      </w:r>
+      <w:r>
+        <w:rPr>
+          <w:sz w:val="24"/>
+        </w:rPr>
+        <w:t>；煮沸使其</w:t>
+      </w:r>
+      <w:r>
+        <w:rPr>
+          <w:b/>
+          <w:color w:val="B7312C"/>
+          <w:sz w:val="24"/>
+        </w:rPr>
+        <w:t>變性</w:t>
+      </w:r>
+      <w:r>
+        <w:rPr>
+          <w:sz w:val="24"/>
+        </w:rPr>
+        <w:t>失去功能，冷卻後不恢復。本模型中，煮沸</w:t>
+      </w:r>
+      <w:r>
+        <w:rPr>
+          <w:b/>
+          <w:color w:val="B7312C"/>
+          <w:sz w:val="24"/>
+        </w:rPr>
+        <w:t>膽汁</w:t>
+      </w:r>
+      <w:r>
+        <w:rPr>
+          <w:sz w:val="24"/>
+        </w:rPr>
+        <w:t>仍保留</w:t>
+      </w:r>
+      <w:r>
+        <w:rPr>
+          <w:b/>
+          <w:color w:val="B7312C"/>
+          <w:sz w:val="24"/>
+        </w:rPr>
+        <w:t>乳化</w:t>
+      </w:r>
+      <w:r>
+        <w:rPr>
+          <w:sz w:val="24"/>
+        </w:rPr>
+        <w:t>作用。</w:t>
+      </w:r>
+    </w:p>
+    <w:p>
+      <w:pPr>
+        <w:spacing w:line="240" w:lineRule="auto" w:after="60"/>
+      </w:pPr>
+      <w:r>
+        <w:drawing>
+          <wp:inline xmlns:a="http://schemas.openxmlformats.org/drawingml/2006/main" xmlns:pic="http://schemas.openxmlformats.org/drawingml/2006/picture">
+            <wp:extent cx="6480000" cy="1296000"/>
+            <wp:docPr id="5" name="Picture 5"/>
+            <wp:cNvGraphicFramePr>
+              <a:graphicFrameLocks noChangeAspect="1"/>
+            </wp:cNvGraphicFramePr>
+            <a:graphic>
+              <a:graphicData uri="http://schemas.openxmlformats.org/drawingml/2006/picture">
+                <pic:pic>
+                  <pic:nvPicPr>
+                    <pic:cNvPr id="0" name="01_emulsification.png"/>
+                    <pic:cNvPicPr/>
+                  </pic:nvPicPr>
+                  <pic:blipFill>
+                    <a:blip r:embed="rId15"/>
+                    <a:stretch>
+                      <a:fillRect/>
+                    </a:stretch>
+                  </pic:blipFill>
+                  <pic:spPr>
+                    <a:xfrm>
+                      <a:off x="0" y="0"/>
+                      <a:ext cx="6480000" cy="1296000"/>
+                    </a:xfrm>
+                    <a:prstGeom prst="rect"/>
+                  </pic:spPr>
+                </pic:pic>
+              </a:graphicData>
+            </a:graphic>
+          </wp:inline>
+        </w:drawing>
+      </w:r>
+    </w:p>
+    <w:p>
+      <w:pPr>
+        <w:spacing w:line="240" w:lineRule="auto" w:after="60"/>
+      </w:pPr>
+      <w:r>
+        <w:drawing>
+          <wp:inline xmlns:a="http://schemas.openxmlformats.org/drawingml/2006/main" xmlns:pic="http://schemas.openxmlformats.org/drawingml/2006/picture">
+            <wp:extent cx="6480000" cy="1296000"/>
+            <wp:docPr id="6" name="Picture 6"/>
+            <wp:cNvGraphicFramePr>
+              <a:graphicFrameLocks noChangeAspect="1"/>
+            </wp:cNvGraphicFramePr>
+            <a:graphic>
+              <a:graphicData uri="http://schemas.openxmlformats.org/drawingml/2006/picture">
+                <pic:pic>
+                  <pic:nvPicPr>
+                    <pic:cNvPr id="0" name="02_hydrolysis.png"/>
+                    <pic:cNvPicPr/>
+                  </pic:nvPicPr>
+                  <pic:blipFill>
+                    <a:blip r:embed="rId16"/>
+                    <a:stretch>
+                      <a:fillRect/>
+                    </a:stretch>
+                  </pic:blipFill>
+                  <pic:spPr>
+                    <a:xfrm>
+                      <a:off x="0" y="0"/>
+                      <a:ext cx="6480000" cy="1296000"/>
+                    </a:xfrm>
+                    <a:prstGeom prst="rect"/>
+                  </pic:spPr>
+                </pic:pic>
+              </a:graphicData>
+            </a:graphic>
+          </wp:inline>
+        </w:drawing>
+      </w:r>
+    </w:p>
+    <w:p>
+      <w:pPr>
+        <w:pageBreakBefore/>
+      </w:pPr>
       <w:r>
         <w:rPr>
           <w:sz w:val="24"/>
@@ -410,8 +758,7 @@
         <w:pageBreakBefore/>
       </w:pPr>
       <w:r>
-        <w:rPr/>
-        <w:t>部分 1｜主探究結果及分析</w:t>
+        <w:t>部分 1｜運用概念分析 X、Y 的個別作用</w:t>
       </w:r>
     </w:p>
     <w:p>
@@ -520,8 +867,7 @@
         <w:pStyle w:val="Heading2"/>
       </w:pPr>
       <w:r>
-        <w:rPr/>
-        <w:t>下一步：X 形成乳狀液，會如何影響其後 Y 的作用？</w:t>
+        <w:t>運用乳化與表面積概念，分析 X 如何幫助 Y。</w:t>
       </w:r>
     </w:p>
     <w:p>
@@ -741,344 +1087,6 @@
           <w:sz w:val="24"/>
         </w:rPr>
         <w:t>☑ 消化液 Y</w:t>
-      </w:r>
-    </w:p>
-    <w:p>
-      <w:pPr>
-        <w:pStyle w:val="Heading1"/>
-        <w:pageBreakBefore/>
-      </w:pPr>
-      <w:r>
-        <w:rPr/>
-        <w:t>學習重點｜課題需知</w:t>
-      </w:r>
-    </w:p>
-    <w:p>
-      <w:r>
-        <w:rPr>
-          <w:sz w:val="24"/>
-        </w:rPr>
-      </w:r>
-      <w:r>
-        <w:rPr>
-          <w:sz w:val="24"/>
-        </w:rPr>
-        <w:t>X 是</w:t>
-      </w:r>
-      <w:r>
-        <w:rPr>
-          <w:b/>
-          <w:color w:val="B7312C"/>
-          <w:sz w:val="24"/>
-        </w:rPr>
-        <w:t>膽汁</w:t>
-      </w:r>
-      <w:r>
-        <w:rPr>
-          <w:sz w:val="24"/>
-        </w:rPr>
-        <w:t>，不含消化酶。它透過</w:t>
-      </w:r>
-      <w:r>
-        <w:rPr>
-          <w:b/>
-          <w:color w:val="B7312C"/>
-          <w:sz w:val="24"/>
-        </w:rPr>
-        <w:t>物理消化</w:t>
-      </w:r>
-      <w:r>
-        <w:rPr>
-          <w:sz w:val="24"/>
-        </w:rPr>
-        <w:t>把大油滴</w:t>
-      </w:r>
-      <w:r>
-        <w:rPr>
-          <w:b/>
-          <w:color w:val="B7312C"/>
-          <w:sz w:val="24"/>
-        </w:rPr>
-        <w:t>乳化</w:t>
-      </w:r>
-      <w:r>
-        <w:rPr>
-          <w:sz w:val="24"/>
-        </w:rPr>
-        <w:t>成小油滴，脂質分子不變；同量脂質的</w:t>
-      </w:r>
-      <w:r>
-        <w:rPr>
-          <w:b/>
-          <w:color w:val="B7312C"/>
-          <w:sz w:val="24"/>
-        </w:rPr>
-        <w:t>總表面積</w:t>
-      </w:r>
-      <w:r>
-        <w:rPr>
-          <w:sz w:val="24"/>
-        </w:rPr>
-        <w:t>增加，有助</w:t>
-      </w:r>
-      <w:r>
-        <w:rPr>
-          <w:b/>
-          <w:color w:val="B7312C"/>
-          <w:sz w:val="24"/>
-        </w:rPr>
-        <w:t>脂肪酶</w:t>
-      </w:r>
-      <w:r>
-        <w:rPr>
-          <w:sz w:val="24"/>
-        </w:rPr>
-        <w:t>接觸脂質。</w:t>
-      </w:r>
-    </w:p>
-    <w:p>
-      <w:r>
-        <w:rPr>
-          <w:sz w:val="24"/>
-        </w:rPr>
-      </w:r>
-      <w:r>
-        <w:rPr>
-          <w:sz w:val="24"/>
-        </w:rPr>
-        <w:t>Y 是</w:t>
-      </w:r>
-      <w:r>
-        <w:rPr>
-          <w:b/>
-          <w:color w:val="B7312C"/>
-          <w:sz w:val="24"/>
-        </w:rPr>
-        <w:t>胰液</w:t>
-      </w:r>
-      <w:r>
-        <w:rPr>
-          <w:sz w:val="24"/>
-        </w:rPr>
-        <w:t>，含有</w:t>
-      </w:r>
-      <w:r>
-        <w:rPr>
-          <w:b/>
-          <w:color w:val="B7312C"/>
-          <w:sz w:val="24"/>
-        </w:rPr>
-        <w:t>脂肪酶</w:t>
-      </w:r>
-      <w:r>
-        <w:rPr>
-          <w:sz w:val="24"/>
-        </w:rPr>
-        <w:t>。</w:t>
-      </w:r>
-      <w:r>
-        <w:rPr>
-          <w:b/>
-          <w:color w:val="B7312C"/>
-          <w:sz w:val="24"/>
-        </w:rPr>
-        <w:t>脂肪酶</w:t>
-      </w:r>
-      <w:r>
-        <w:rPr>
-          <w:sz w:val="24"/>
-        </w:rPr>
-        <w:t>催化</w:t>
-      </w:r>
-      <w:r>
-        <w:rPr>
-          <w:b/>
-          <w:color w:val="B7312C"/>
-          <w:sz w:val="24"/>
-        </w:rPr>
-        <w:t>化學消化</w:t>
-      </w:r>
-      <w:r>
-        <w:rPr>
-          <w:sz w:val="24"/>
-        </w:rPr>
-        <w:t>，按本課完全水解簡化模型，把脂質分解為</w:t>
-      </w:r>
-      <w:r>
-        <w:rPr>
-          <w:b/>
-          <w:color w:val="B7312C"/>
-          <w:sz w:val="24"/>
-        </w:rPr>
-        <w:t>甘油</w:t>
-      </w:r>
-      <w:r>
-        <w:rPr>
-          <w:sz w:val="24"/>
-        </w:rPr>
-        <w:t>和</w:t>
-      </w:r>
-      <w:r>
-        <w:rPr>
-          <w:b/>
-          <w:color w:val="B7312C"/>
-          <w:sz w:val="24"/>
-        </w:rPr>
-        <w:t>脂肪酸</w:t>
-      </w:r>
-      <w:r>
-        <w:rPr>
-          <w:sz w:val="24"/>
-        </w:rPr>
-        <w:t>。</w:t>
-      </w:r>
-      <w:r>
-        <w:rPr>
-          <w:b/>
-          <w:color w:val="B7312C"/>
-          <w:sz w:val="24"/>
-        </w:rPr>
-        <w:t>脂肪酶</w:t>
-      </w:r>
-      <w:r>
-        <w:rPr>
-          <w:sz w:val="24"/>
-        </w:rPr>
-        <w:t>是</w:t>
-      </w:r>
-      <w:r>
-        <w:rPr>
-          <w:b/>
-          <w:color w:val="B7312C"/>
-          <w:sz w:val="24"/>
-        </w:rPr>
-        <w:t>蛋白質</w:t>
-      </w:r>
-      <w:r>
-        <w:rPr>
-          <w:sz w:val="24"/>
-        </w:rPr>
-        <w:t>；煮沸使其</w:t>
-      </w:r>
-      <w:r>
-        <w:rPr>
-          <w:b/>
-          <w:color w:val="B7312C"/>
-          <w:sz w:val="24"/>
-        </w:rPr>
-        <w:t>變性</w:t>
-      </w:r>
-      <w:r>
-        <w:rPr>
-          <w:sz w:val="24"/>
-        </w:rPr>
-        <w:t>失去功能，冷卻後不恢復。本模型中，煮沸</w:t>
-      </w:r>
-      <w:r>
-        <w:rPr>
-          <w:b/>
-          <w:color w:val="B7312C"/>
-          <w:sz w:val="24"/>
-        </w:rPr>
-        <w:t>膽汁</w:t>
-      </w:r>
-      <w:r>
-        <w:rPr>
-          <w:sz w:val="24"/>
-        </w:rPr>
-        <w:t>仍保留</w:t>
-      </w:r>
-      <w:r>
-        <w:rPr>
-          <w:b/>
-          <w:color w:val="B7312C"/>
-          <w:sz w:val="24"/>
-        </w:rPr>
-        <w:t>乳化</w:t>
-      </w:r>
-      <w:r>
-        <w:rPr>
-          <w:sz w:val="24"/>
-        </w:rPr>
-        <w:t>作用。</w:t>
-      </w:r>
-    </w:p>
-    <w:p>
-      <w:pPr>
-        <w:spacing w:line="240" w:lineRule="auto" w:after="60"/>
-      </w:pPr>
-      <w:r>
-        <w:drawing>
-          <wp:inline xmlns:a="http://schemas.openxmlformats.org/drawingml/2006/main" xmlns:pic="http://schemas.openxmlformats.org/drawingml/2006/picture">
-            <wp:extent cx="6480000" cy="1296000"/>
-            <wp:docPr id="5" name="Picture 5"/>
-            <wp:cNvGraphicFramePr>
-              <a:graphicFrameLocks noChangeAspect="1"/>
-            </wp:cNvGraphicFramePr>
-            <a:graphic>
-              <a:graphicData uri="http://schemas.openxmlformats.org/drawingml/2006/picture">
-                <pic:pic>
-                  <pic:nvPicPr>
-                    <pic:cNvPr id="0" name="01_emulsification.png"/>
-                    <pic:cNvPicPr/>
-                  </pic:nvPicPr>
-                  <pic:blipFill>
-                    <a:blip r:embed="rId15"/>
-                    <a:stretch>
-                      <a:fillRect/>
-                    </a:stretch>
-                  </pic:blipFill>
-                  <pic:spPr>
-                    <a:xfrm>
-                      <a:off x="0" y="0"/>
-                      <a:ext cx="6480000" cy="1296000"/>
-                    </a:xfrm>
-                    <a:prstGeom prst="rect"/>
-                  </pic:spPr>
-                </pic:pic>
-              </a:graphicData>
-            </a:graphic>
-          </wp:inline>
-        </w:drawing>
-      </w:r>
-    </w:p>
-    <w:p>
-      <w:pPr>
-        <w:spacing w:line="240" w:lineRule="auto" w:after="60"/>
-      </w:pPr>
-      <w:r>
-        <w:drawing>
-          <wp:inline xmlns:a="http://schemas.openxmlformats.org/drawingml/2006/main" xmlns:pic="http://schemas.openxmlformats.org/drawingml/2006/picture">
-            <wp:extent cx="6480000" cy="1296000"/>
-            <wp:docPr id="6" name="Picture 6"/>
-            <wp:cNvGraphicFramePr>
-              <a:graphicFrameLocks noChangeAspect="1"/>
-            </wp:cNvGraphicFramePr>
-            <a:graphic>
-              <a:graphicData uri="http://schemas.openxmlformats.org/drawingml/2006/picture">
-                <pic:pic>
-                  <pic:nvPicPr>
-                    <pic:cNvPr id="0" name="02_hydrolysis.png"/>
-                    <pic:cNvPicPr/>
-                  </pic:nvPicPr>
-                  <pic:blipFill>
-                    <a:blip r:embed="rId16"/>
-                    <a:stretch>
-                      <a:fillRect/>
-                    </a:stretch>
-                  </pic:blipFill>
-                  <pic:spPr>
-                    <a:xfrm>
-                      <a:off x="0" y="0"/>
-                      <a:ext cx="6480000" cy="1296000"/>
-                    </a:xfrm>
-                    <a:prstGeom prst="rect"/>
-                  </pic:spPr>
-                </pic:pic>
-              </a:graphicData>
-            </a:graphic>
-          </wp:inline>
-        </w:drawing>
       </w:r>
     </w:p>
     <w:p>

</xml_diff>

<commit_message>
Frame paper activities as applying concepts to supplied experimental data
</commit_message>
<xml_diff>
--- a/paperwork/generated/WS1_answers.docx
+++ b/paperwork/generated/WS1_answers.docx
@@ -421,7 +421,7 @@
       </w:pPr>
       <w:r>
         <w:rPr/>
-        <w:t>部分 1｜主探究設計：比較 X 與 Y</w:t>
+        <w:t>部分 1｜研究情境與公平比較</w:t>
       </w:r>
     </w:p>
     <w:p>
@@ -429,7 +429,7 @@
         <w:rPr>
           <w:sz w:val="24"/>
         </w:rPr>
-        <w:t>相同油水混合物分別加入 2 mL X 或 2 mL Y；在 37°C 同樣搖勻，比較一小時後的外觀。</w:t>
+        <w:t>研究員在相同油水混合物分別加入 2 mL X 或 2 mL Y；在 37°C 同樣搖勻，比較一小時後的外觀。</w:t>
       </w:r>
     </w:p>
     <w:p>
@@ -875,7 +875,7 @@
         <w:rPr>
           <w:sz w:val="24"/>
         </w:rPr>
-        <w:t>延伸一會重新準備兩支試管，先加 X 或等量水並搖勻，再加入相同量的 Y；兩組的預處理時間相同。</w:t>
+        <w:t>研究員重新準備兩支試管，先加 X 或等量水並搖勻，再加入相同量的 Y；兩組的預處理時間相同。</w:t>
       </w:r>
     </w:p>
     <w:p>
@@ -1020,7 +1020,7 @@
         <w:rPr>
           <w:sz w:val="24"/>
         </w:rPr>
-        <w:t>以延伸一的未煮沸 X 後加 Y 組為比較基準。每次只煮沸一種液體，冷卻至 37°C，按相同次序各加 1 mL X、Y；觀察一小時後結果。</w:t>
+        <w:t>研究員以延伸一的未煮沸 X 後加 Y 組為比較基準。每次只煮沸一種液體，冷卻至 37°C，按相同次序各加 1 mL X、Y；觀察一小時後結果。</w:t>
       </w:r>
     </w:p>
     <w:p>
@@ -1156,7 +1156,7 @@
       <w:rPr>
         <w:sz w:val="22"/>
       </w:rPr>
-      <w:t>生物科｜未知消化液探究｜參考答案</w:t>
+      <w:t>生物科｜脂質消化的概念與應用｜參考答案</w:t>
     </w:r>
   </w:p>
 </w:hdr>

</xml_diff>

<commit_message>
Restore reference topic notes exactly and remove redundant paper appearance questions
</commit_message>
<xml_diff>
--- a/paperwork/generated/WS1_answers.docx
+++ b/paperwork/generated/WS1_answers.docx
@@ -30,133 +30,56 @@
     </w:p>
     <w:p>
       <w:pPr>
-        <w:pStyle w:val="Heading1"/>
-        <w:pageBreakBefore w:val="0"/>
+        <w:pStyle w:val="21"/>
+        <w:rPr>
+          <w:lang w:eastAsia="zh-TW"/>
+        </w:rPr>
       </w:pPr>
       <w:r>
+        <w:rPr>
+          <w:lang w:eastAsia="zh-TW"/>
+        </w:rPr>
         <w:t>課題需知</w:t>
+      </w:r>
+    </w:p>
+    <w:p>
+      <w:pPr>
+        <w:pStyle w:val="31"/>
+        <w:rPr>
+          <w:lang w:eastAsia="zh-TW"/>
+        </w:rPr>
+      </w:pPr>
+      <w:r>
+        <w:rPr>
+          <w:lang w:eastAsia="zh-TW"/>
+        </w:rPr>
+        <w:t>01</w:t>
+      </w:r>
+      <w:r>
+        <w:rPr>
+          <w:lang w:eastAsia="zh-TW"/>
+        </w:rPr>
+        <w:t xml:space="preserve">　膽汁：乳化脂質</w:t>
       </w:r>
     </w:p>
     <w:p>
       <w:r>
         <w:rPr>
-          <w:sz w:val="24"/>
+          <w:lang w:eastAsia="zh-TW"/>
         </w:rPr>
-      </w:r>
-      <w:r>
-        <w:rPr>
-          <w:sz w:val="24"/>
-        </w:rPr>
-        <w:t>X 是</w:t>
+        <w:t>本教學模型設定消化液 X 是</w:t>
       </w:r>
       <w:r>
         <w:rPr>
           <w:b/>
           <w:color w:val="B7312C"/>
-          <w:sz w:val="24"/>
+          <w:lang w:eastAsia="zh-TW"/>
         </w:rPr>
         <w:t>膽汁</w:t>
       </w:r>
       <w:r>
         <w:rPr>
-          <w:sz w:val="24"/>
-        </w:rPr>
-        <w:t>，由肝臟製造並儲存於膽囊，不含消化酶。它透過</w:t>
-      </w:r>
-      <w:r>
-        <w:rPr>
-          <w:b/>
-          <w:color w:val="B7312C"/>
-          <w:sz w:val="24"/>
-        </w:rPr>
-        <w:t>物理消化</w:t>
-      </w:r>
-      <w:r>
-        <w:rPr>
-          <w:sz w:val="24"/>
-        </w:rPr>
-        <w:t>把大油滴</w:t>
-      </w:r>
-      <w:r>
-        <w:rPr>
-          <w:b/>
-          <w:color w:val="B7312C"/>
-          <w:sz w:val="24"/>
-        </w:rPr>
-        <w:t>乳化</w:t>
-      </w:r>
-      <w:r>
-        <w:rPr>
-          <w:sz w:val="24"/>
-        </w:rPr>
-        <w:t>成小油滴，脂質分子不變；同量脂質的</w:t>
-      </w:r>
-      <w:r>
-        <w:rPr>
-          <w:b/>
-          <w:color w:val="B7312C"/>
-          <w:sz w:val="24"/>
-        </w:rPr>
-        <w:t>總表面積</w:t>
-      </w:r>
-      <w:r>
-        <w:rPr>
-          <w:sz w:val="24"/>
-        </w:rPr>
-        <w:t>增加，有助</w:t>
-      </w:r>
-      <w:r>
-        <w:rPr>
-          <w:b/>
-          <w:color w:val="B7312C"/>
-          <w:sz w:val="24"/>
-        </w:rPr>
-        <w:t>脂肪酶</w:t>
-      </w:r>
-      <w:r>
-        <w:rPr>
-          <w:sz w:val="24"/>
-        </w:rPr>
-        <w:t>接觸脂質。</w:t>
-      </w:r>
-    </w:p>
-    <w:p>
-      <w:r>
-        <w:rPr>
-          <w:sz w:val="24"/>
-        </w:rPr>
-      </w:r>
-      <w:r>
-        <w:rPr>
-          <w:sz w:val="24"/>
-        </w:rPr>
-        <w:t>Y 是</w:t>
-      </w:r>
-      <w:r>
-        <w:rPr>
-          <w:b/>
-          <w:color w:val="B7312C"/>
-          <w:sz w:val="24"/>
-        </w:rPr>
-        <w:t>胰液</w:t>
-      </w:r>
-      <w:r>
-        <w:rPr>
-          <w:sz w:val="24"/>
-        </w:rPr>
-        <w:t>，含有</w:t>
-      </w:r>
-      <w:r>
-        <w:rPr>
-          <w:b/>
-          <w:color w:val="B7312C"/>
-          <w:sz w:val="24"/>
-        </w:rPr>
-        <w:t>脂肪酶</w:t>
-      </w:r>
-      <w:r>
-        <w:rPr>
-          <w:sz w:val="24"/>
+          <w:lang w:eastAsia="zh-TW"/>
         </w:rPr>
         <w:t>。</w:t>
       </w:r>
@@ -164,150 +87,117 @@
         <w:rPr>
           <w:b/>
           <w:color w:val="B7312C"/>
-          <w:sz w:val="24"/>
+          <w:lang w:eastAsia="zh-TW"/>
+        </w:rPr>
+        <w:t>膽汁</w:t>
+      </w:r>
+      <w:r>
+        <w:rPr>
+          <w:lang w:eastAsia="zh-TW"/>
+        </w:rPr>
+        <w:t>由肝臟製造，儲存於膽囊，不含消化酶。它把大油滴</w:t>
+      </w:r>
+      <w:r>
+        <w:rPr>
+          <w:b/>
+          <w:color w:val="B7312C"/>
+          <w:lang w:eastAsia="zh-TW"/>
+        </w:rPr>
+        <w:t>乳化</w:t>
+      </w:r>
+      <w:r>
+        <w:rPr>
+          <w:lang w:eastAsia="zh-TW"/>
+        </w:rPr>
+        <w:t>成</w:t>
+      </w:r>
+      <w:r>
+        <w:rPr>
+          <w:b/>
+          <w:color w:val="B7312C"/>
+          <w:lang w:eastAsia="zh-TW"/>
+        </w:rPr>
+        <w:t>小油滴</w:t>
+      </w:r>
+      <w:r>
+        <w:rPr>
+          <w:lang w:eastAsia="zh-TW"/>
+        </w:rPr>
+        <w:t>，增加同量脂質的</w:t>
+      </w:r>
+      <w:r>
+        <w:rPr>
+          <w:b/>
+          <w:color w:val="B7312C"/>
+          <w:lang w:eastAsia="zh-TW"/>
+        </w:rPr>
+        <w:t>總表面積</w:t>
+      </w:r>
+      <w:r>
+        <w:rPr>
+          <w:lang w:eastAsia="zh-TW"/>
+        </w:rPr>
+        <w:t>，有助</w:t>
+      </w:r>
+      <w:r>
+        <w:rPr>
+          <w:b/>
+          <w:color w:val="B7312C"/>
+          <w:lang w:eastAsia="zh-TW"/>
         </w:rPr>
         <w:t>脂肪酶</w:t>
       </w:r>
       <w:r>
         <w:rPr>
-          <w:sz w:val="24"/>
+          <w:lang w:eastAsia="zh-TW"/>
         </w:rPr>
-        <w:t>催化</w:t>
+        <w:t>作用。</w:t>
+      </w:r>
+      <w:proofErr w:type="spellStart"/>
+      <w:r>
+        <w:t>這屬</w:t>
       </w:r>
       <w:r>
         <w:rPr>
           <w:b/>
           <w:color w:val="B7312C"/>
-          <w:sz w:val="24"/>
         </w:rPr>
-        <w:t>化學消化</w:t>
+        <w:t>物理消化</w:t>
       </w:r>
       <w:r>
-        <w:rPr>
-          <w:sz w:val="24"/>
-        </w:rPr>
-        <w:t>，按本課完全水解簡化模型，把脂質分解為</w:t>
+        <w:t>，脂質分子的結構沒有改變</w:t>
       </w:r>
+      <w:proofErr w:type="spellEnd"/>
       <w:r>
-        <w:rPr>
-          <w:b/>
-          <w:color w:val="B7312C"/>
-          <w:sz w:val="24"/>
-        </w:rPr>
-        <w:t>甘油</w:t>
-      </w:r>
-      <w:r>
-        <w:rPr>
-          <w:sz w:val="24"/>
-        </w:rPr>
-        <w:t>和</w:t>
-      </w:r>
-      <w:r>
-        <w:rPr>
-          <w:b/>
-          <w:color w:val="B7312C"/>
-          <w:sz w:val="24"/>
-        </w:rPr>
-        <w:t>脂肪酸</w:t>
-      </w:r>
-      <w:r>
-        <w:rPr>
-          <w:sz w:val="24"/>
-        </w:rPr>
         <w:t>。</w:t>
-      </w:r>
-      <w:r>
-        <w:rPr>
-          <w:b/>
-          <w:color w:val="B7312C"/>
-          <w:sz w:val="24"/>
-        </w:rPr>
-        <w:t>脂肪酶</w:t>
-      </w:r>
-      <w:r>
-        <w:rPr>
-          <w:sz w:val="24"/>
-        </w:rPr>
-        <w:t>是</w:t>
-      </w:r>
-      <w:r>
-        <w:rPr>
-          <w:b/>
-          <w:color w:val="B7312C"/>
-          <w:sz w:val="24"/>
-        </w:rPr>
-        <w:t>蛋白質</w:t>
-      </w:r>
-      <w:r>
-        <w:rPr>
-          <w:sz w:val="24"/>
-        </w:rPr>
-        <w:t>；煮沸使其</w:t>
-      </w:r>
-      <w:r>
-        <w:rPr>
-          <w:b/>
-          <w:color w:val="B7312C"/>
-          <w:sz w:val="24"/>
-        </w:rPr>
-        <w:t>變性</w:t>
-      </w:r>
-      <w:r>
-        <w:rPr>
-          <w:sz w:val="24"/>
-        </w:rPr>
-        <w:t>失去功能，冷卻後不恢復。本模型中，煮沸</w:t>
-      </w:r>
-      <w:r>
-        <w:rPr>
-          <w:b/>
-          <w:color w:val="B7312C"/>
-          <w:sz w:val="24"/>
-        </w:rPr>
-        <w:t>膽汁</w:t>
-      </w:r>
-      <w:r>
-        <w:rPr>
-          <w:sz w:val="24"/>
-        </w:rPr>
-        <w:t>仍保留</w:t>
-      </w:r>
-      <w:r>
-        <w:rPr>
-          <w:b/>
-          <w:color w:val="B7312C"/>
-          <w:sz w:val="24"/>
-        </w:rPr>
-        <w:t>乳化</w:t>
-      </w:r>
-      <w:r>
-        <w:rPr>
-          <w:sz w:val="24"/>
-        </w:rPr>
-        <w:t>作用。</w:t>
       </w:r>
     </w:p>
     <w:p>
       <w:pPr>
-        <w:spacing w:line="240" w:lineRule="auto" w:after="60"/>
+        <w:spacing w:after="40" w:line="240" w:lineRule="auto"/>
+        <w:jc w:val="center"/>
       </w:pPr>
       <w:r>
+        <w:rPr>
+          <w:noProof/>
+        </w:rPr>
         <w:drawing>
-          <wp:inline xmlns:a="http://schemas.openxmlformats.org/drawingml/2006/main" xmlns:pic="http://schemas.openxmlformats.org/drawingml/2006/picture">
-            <wp:extent cx="6480000" cy="1296000"/>
-            <wp:docPr id="5" name="Picture 5"/>
+          <wp:inline distT="0" distB="0" distL="0" distR="0" wp14:anchorId="4AB9DBB2" wp14:editId="572E0DB6">
+            <wp:extent cx="6480000" cy="1908000"/>
+            <wp:effectExtent l="0" t="0" r="0" b="0"/>
+            <wp:docPr id="1" name="Picture 1"/>
             <wp:cNvGraphicFramePr>
-              <a:graphicFrameLocks noChangeAspect="1"/>
+              <a:graphicFrameLocks xmlns:a="http://schemas.openxmlformats.org/drawingml/2006/main" noChangeAspect="1"/>
             </wp:cNvGraphicFramePr>
-            <a:graphic>
+            <a:graphic xmlns:a="http://schemas.openxmlformats.org/drawingml/2006/main">
               <a:graphicData uri="http://schemas.openxmlformats.org/drawingml/2006/picture">
-                <pic:pic>
+                <pic:pic xmlns:pic="http://schemas.openxmlformats.org/drawingml/2006/picture">
                   <pic:nvPicPr>
                     <pic:cNvPr id="0" name="01_emulsification.png"/>
                     <pic:cNvPicPr/>
                   </pic:nvPicPr>
                   <pic:blipFill>
-                    <a:blip r:embed="rId15"/>
+                    <a:blip r:embed="rId17"/>
                     <a:stretch>
                       <a:fillRect/>
                     </a:stretch>
@@ -315,9 +205,11 @@
                   <pic:spPr>
                     <a:xfrm>
                       <a:off x="0" y="0"/>
-                      <a:ext cx="6480000" cy="1296000"/>
+                      <a:ext cx="6480000" cy="1908000"/>
                     </a:xfrm>
-                    <a:prstGeom prst="rect"/>
+                    <a:prstGeom prst="rect">
+                      <a:avLst/>
+                    </a:prstGeom>
                   </pic:spPr>
                 </pic:pic>
               </a:graphicData>
@@ -328,25 +220,203 @@
     </w:p>
     <w:p>
       <w:pPr>
-        <w:spacing w:line="240" w:lineRule="auto" w:after="60"/>
+        <w:pStyle w:val="31"/>
+        <w:rPr>
+          <w:lang w:eastAsia="zh-TW"/>
+        </w:rPr>
       </w:pPr>
       <w:r>
+        <w:rPr>
+          <w:lang w:eastAsia="zh-TW"/>
+        </w:rPr>
+        <w:t>02</w:t>
+      </w:r>
+      <w:r>
+        <w:rPr>
+          <w:lang w:eastAsia="zh-TW"/>
+        </w:rPr>
+        <w:t xml:space="preserve">　胰液中的脂肪酶：催化化學消化</w:t>
+      </w:r>
+    </w:p>
+    <w:p>
+      <w:pPr>
+        <w:rPr>
+          <w:lang w:eastAsia="zh-TW"/>
+        </w:rPr>
+      </w:pPr>
+      <w:r>
+        <w:rPr>
+          <w:lang w:eastAsia="zh-TW"/>
+        </w:rPr>
+        <w:t>本教學模型設定消化液 Y 是</w:t>
+      </w:r>
+      <w:r>
+        <w:rPr>
+          <w:b/>
+          <w:color w:val="B7312C"/>
+          <w:lang w:eastAsia="zh-TW"/>
+        </w:rPr>
+        <w:t>胰液</w:t>
+      </w:r>
+      <w:r>
+        <w:rPr>
+          <w:lang w:eastAsia="zh-TW"/>
+        </w:rPr>
+        <w:t>，含有</w:t>
+      </w:r>
+      <w:r>
+        <w:rPr>
+          <w:b/>
+          <w:color w:val="B7312C"/>
+          <w:lang w:eastAsia="zh-TW"/>
+        </w:rPr>
+        <w:t>脂肪酶</w:t>
+      </w:r>
+      <w:r>
+        <w:rPr>
+          <w:lang w:eastAsia="zh-TW"/>
+        </w:rPr>
+        <w:t>。</w:t>
+      </w:r>
+      <w:r>
+        <w:rPr>
+          <w:b/>
+          <w:color w:val="B7312C"/>
+          <w:lang w:eastAsia="zh-TW"/>
+        </w:rPr>
+        <w:t>脂肪酶</w:t>
+      </w:r>
+      <w:r>
+        <w:rPr>
+          <w:lang w:eastAsia="zh-TW"/>
+        </w:rPr>
+        <w:t>負責催化脂質的</w:t>
+      </w:r>
+      <w:r>
+        <w:rPr>
+          <w:b/>
+          <w:color w:val="B7312C"/>
+          <w:lang w:eastAsia="zh-TW"/>
+        </w:rPr>
+        <w:t>化學消化</w:t>
+      </w:r>
+      <w:r>
+        <w:rPr>
+          <w:lang w:eastAsia="zh-TW"/>
+        </w:rPr>
+        <w:t>；本課以完全水解的簡化模型，表示</w:t>
+      </w:r>
+      <w:r>
+        <w:rPr>
+          <w:b/>
+          <w:color w:val="B7312C"/>
+          <w:lang w:eastAsia="zh-TW"/>
+        </w:rPr>
+        <w:t>甘油三酯</w:t>
+      </w:r>
+      <w:r>
+        <w:rPr>
+          <w:lang w:eastAsia="zh-TW"/>
+        </w:rPr>
+        <w:t>分解為</w:t>
+      </w:r>
+      <w:r>
+        <w:rPr>
+          <w:b/>
+          <w:color w:val="B7312C"/>
+          <w:lang w:eastAsia="zh-TW"/>
+        </w:rPr>
+        <w:t>甘油</w:t>
+      </w:r>
+      <w:r>
+        <w:rPr>
+          <w:lang w:eastAsia="zh-TW"/>
+        </w:rPr>
+        <w:t>與</w:t>
+      </w:r>
+      <w:r>
+        <w:rPr>
+          <w:b/>
+          <w:color w:val="B7312C"/>
+          <w:lang w:eastAsia="zh-TW"/>
+        </w:rPr>
+        <w:t>脂肪酸</w:t>
+      </w:r>
+      <w:r>
+        <w:rPr>
+          <w:lang w:eastAsia="zh-TW"/>
+        </w:rPr>
+        <w:t>，以助吸收。</w:t>
+      </w:r>
+      <w:r>
+        <w:rPr>
+          <w:b/>
+          <w:color w:val="B7312C"/>
+          <w:lang w:eastAsia="zh-TW"/>
+        </w:rPr>
+        <w:t>脂肪酶</w:t>
+      </w:r>
+      <w:r>
+        <w:rPr>
+          <w:lang w:eastAsia="zh-TW"/>
+        </w:rPr>
+        <w:t>是</w:t>
+      </w:r>
+      <w:r>
+        <w:rPr>
+          <w:b/>
+          <w:color w:val="B7312C"/>
+          <w:lang w:eastAsia="zh-TW"/>
+        </w:rPr>
+        <w:t>蛋白質</w:t>
+      </w:r>
+      <w:r>
+        <w:rPr>
+          <w:lang w:eastAsia="zh-TW"/>
+        </w:rPr>
+        <w:t>，高溫可使其</w:t>
+      </w:r>
+      <w:r>
+        <w:rPr>
+          <w:b/>
+          <w:color w:val="B7312C"/>
+          <w:lang w:eastAsia="zh-TW"/>
+        </w:rPr>
+        <w:t>變性</w:t>
+      </w:r>
+      <w:r>
+        <w:rPr>
+          <w:lang w:eastAsia="zh-TW"/>
+        </w:rPr>
+        <w:t>，失去功能。</w:t>
+      </w:r>
+    </w:p>
+    <w:p>
+      <w:pPr>
+        <w:spacing w:after="40" w:line="240" w:lineRule="auto"/>
+        <w:jc w:val="center"/>
+      </w:pPr>
+      <w:r>
+        <w:rPr>
+          <w:noProof/>
+        </w:rPr>
         <w:drawing>
-          <wp:inline xmlns:a="http://schemas.openxmlformats.org/drawingml/2006/main" xmlns:pic="http://schemas.openxmlformats.org/drawingml/2006/picture">
-            <wp:extent cx="6480000" cy="1296000"/>
-            <wp:docPr id="6" name="Picture 6"/>
+          <wp:inline distT="0" distB="0" distL="0" distR="0" wp14:anchorId="1CD0D4FD" wp14:editId="1287A788">
+            <wp:extent cx="6480000" cy="2088000"/>
+            <wp:effectExtent l="0" t="0" r="0" b="0"/>
+            <wp:docPr id="2" name="Picture 2"/>
             <wp:cNvGraphicFramePr>
-              <a:graphicFrameLocks noChangeAspect="1"/>
+              <a:graphicFrameLocks xmlns:a="http://schemas.openxmlformats.org/drawingml/2006/main" noChangeAspect="1"/>
             </wp:cNvGraphicFramePr>
-            <a:graphic>
+            <a:graphic xmlns:a="http://schemas.openxmlformats.org/drawingml/2006/main">
               <a:graphicData uri="http://schemas.openxmlformats.org/drawingml/2006/picture">
-                <pic:pic>
+                <pic:pic xmlns:pic="http://schemas.openxmlformats.org/drawingml/2006/picture">
                   <pic:nvPicPr>
                     <pic:cNvPr id="0" name="02_hydrolysis.png"/>
                     <pic:cNvPicPr/>
                   </pic:nvPicPr>
                   <pic:blipFill>
-                    <a:blip r:embed="rId16"/>
+                    <a:blip r:embed="rId18"/>
                     <a:stretch>
                       <a:fillRect/>
                     </a:stretch>
@@ -354,9 +424,11 @@
                   <pic:spPr>
                     <a:xfrm>
                       <a:off x="0" y="0"/>
-                      <a:ext cx="6480000" cy="1296000"/>
+                      <a:ext cx="6480000" cy="2088000"/>
                     </a:xfrm>
-                    <a:prstGeom prst="rect"/>
+                    <a:prstGeom prst="rect">
+                      <a:avLst/>
+                    </a:prstGeom>
                   </pic:spPr>
                 </pic:pic>
               </a:graphicData>
@@ -813,60 +885,6 @@
         <w:pStyle w:val="Heading2"/>
       </w:pPr>
       <w:r>
-        <w:rPr/>
-        <w:t>3. X 組一小時後的主要外觀</w:t>
-      </w:r>
-    </w:p>
-    <w:p>
-      <w:r>
-        <w:rPr>
-          <w:b/>
-          <w:color w:val="145DA0"/>
-          <w:sz w:val="24"/>
-        </w:rPr>
-        <w:t>☑ 混濁乳狀液</w:t>
-      </w:r>
-    </w:p>
-    <w:p>
-      <w:r>
-        <w:rPr>
-          <w:sz w:val="24"/>
-        </w:rPr>
-        <w:t>□ 油層消失</w:t>
-      </w:r>
-    </w:p>
-    <w:p>
-      <w:pPr>
-        <w:pStyle w:val="Heading2"/>
-      </w:pPr>
-      <w:r>
-        <w:rPr/>
-        <w:t>4. Y 組一小時後的主要外觀</w:t>
-      </w:r>
-    </w:p>
-    <w:p>
-      <w:r>
-        <w:rPr>
-          <w:b/>
-          <w:color w:val="145DA0"/>
-          <w:sz w:val="24"/>
-        </w:rPr>
-        <w:t>☑ 油層變薄，但仍有油水分層</w:t>
-      </w:r>
-    </w:p>
-    <w:p>
-      <w:r>
-        <w:rPr>
-          <w:sz w:val="24"/>
-        </w:rPr>
-        <w:t>□ 油層沒有明顯變化</w:t>
-      </w:r>
-    </w:p>
-    <w:p>
-      <w:pPr>
-        <w:pStyle w:val="Heading2"/>
-      </w:pPr>
-      <w:r>
         <w:t>運用乳化與表面積概念，分析 X 如何幫助 Y。</w:t>
       </w:r>
     </w:p>
@@ -940,7 +958,7 @@
       </w:pPr>
       <w:r>
         <w:rPr/>
-        <w:t>5. X 如何有助其後 Y 的作用？</w:t>
+        <w:t>3. X 如何有助其後 Y 的作用？</w:t>
       </w:r>
     </w:p>
     <w:p>
@@ -985,7 +1003,7 @@
       </w:pPr>
       <w:r>
         <w:rPr/>
-        <w:t>6. 外觀能告訴我們甚麼？</w:t>
+        <w:t>4. 外觀能告訴我們甚麼？</w:t>
       </w:r>
     </w:p>
     <w:p>
@@ -1068,7 +1086,7 @@
       </w:pPr>
       <w:r>
         <w:rPr/>
-        <w:t>7. 煮沸後失去作用的消化液</w:t>
+        <w:t>5. 煮沸後失去作用的消化液</w:t>
       </w:r>
     </w:p>
     <w:p>
@@ -1103,7 +1121,7 @@
         <w:rPr>
           <w:sz w:val="24"/>
         </w:rPr>
-        <w:t>8. 綜合實驗結果與課題需知，解釋膽汁與胰液中的脂肪酶如何共同幫助脂質消化，以及煮沸如何影響它們的作用。</w:t>
+        <w:t>6. 綜合實驗結果與課題需知，解釋膽汁與胰液中的脂肪酶如何共同幫助脂質消化，以及煮沸如何影響它們的作用。</w:t>
       </w:r>
     </w:p>
     <w:p>
@@ -13214,6 +13232,64 @@
         <w:shd w:val="clear" w:color="auto" w:fill="FBCAA2" w:themeFill="accent6" w:themeFillTint="7F"/>
       </w:tcPr>
     </w:tblStylePr>
+  </w:style>
+  <w:style w:type="paragraph" w:styleId="21">
+    <w:name w:val="Reference Heading 2"/>
+    <w:basedOn w:val="a1"/>
+    <w:next w:val="a1"/>
+    <w:link w:val="22"/>
+    <w:uiPriority w:val="9"/>
+    <w:unhideWhenUsed/>
+    <w:qFormat/>
+    <w:rsid w:val="00FC693F"/>
+    <w:pPr>
+      <w:keepNext/>
+      <w:keepLines/>
+      <w:spacing w:before="120" w:line="276" w:lineRule="auto"/>
+      <w:outlineLvl w:val="1"/>
+    </w:pPr>
+    <w:rPr>
+      <w:rFonts w:asciiTheme="majorHAnsi" w:eastAsiaTheme="majorEastAsia" w:hAnsiTheme="majorHAnsi" w:cstheme="majorBidi"/>
+      <w:b/>
+      <w:bCs/>
+      <w:color w:val="245D60"/>
+      <w:szCs w:val="26"/>
+    </w:rPr>
+  </w:style>
+  <w:style w:type="paragraph" w:styleId="31">
+    <w:name w:val="Reference Heading 3"/>
+    <w:basedOn w:val="a1"/>
+    <w:next w:val="a1"/>
+    <w:link w:val="32"/>
+    <w:uiPriority w:val="9"/>
+    <w:unhideWhenUsed/>
+    <w:qFormat/>
+    <w:rsid w:val="00FC693F"/>
+    <w:pPr>
+      <w:keepNext/>
+      <w:keepLines/>
+      <w:spacing w:before="120" w:line="276" w:lineRule="auto"/>
+      <w:outlineLvl w:val="2"/>
+    </w:pPr>
+    <w:rPr>
+      <w:rFonts w:asciiTheme="majorHAnsi" w:eastAsiaTheme="majorEastAsia" w:hAnsiTheme="majorHAnsi" w:cstheme="majorBidi"/>
+      <w:b/>
+      <w:bCs/>
+      <w:color w:val="245D60"/>
+    </w:rPr>
+  </w:style>
+  <w:style w:type="paragraph" w:default="1" w:styleId="a1">
+    <w:name w:val="Reference Normal"/>
+    <w:qFormat/>
+    <w:rsid w:val="00FC693F"/>
+    <w:pPr>
+      <w:spacing w:after="100" w:line="360" w:lineRule="auto"/>
+    </w:pPr>
+    <w:rPr>
+      <w:rFonts w:ascii="Noto Sans CJK TC" w:eastAsia="Noto Sans CJK TC" w:hAnsi="Noto Sans CJK TC"/>
+      <w:color w:val="202B2C"/>
+      <w:sz w:val="24"/>
+    </w:rPr>
   </w:style>
 </w:styles>
 </file>

</xml_diff>

<commit_message>
Apply reviewed worksheet questions, checkbox choices and requested diagram refinements
</commit_message>
<xml_diff>
--- a/paperwork/generated/WS1_answers.docx
+++ b/paperwork/generated/WS1_answers.docx
@@ -9,7 +9,7 @@
       </w:pPr>
       <w:r>
         <w:rPr/>
-        <w:t>工作紙一：脂質消化的概念與應用</w:t>
+        <w:t>工作紙一：脂質的消化與公平比較</w:t>
       </w:r>
     </w:p>
     <w:p>
@@ -67,7 +67,6 @@
         <w:rPr>
           <w:lang w:eastAsia="zh-TW"/>
         </w:rPr>
-        <w:t>本教學模型設定消化液 X 是</w:t>
       </w:r>
       <w:r>
         <w:rPr>
@@ -75,13 +74,11 @@
           <w:color w:val="B7312C"/>
           <w:lang w:eastAsia="zh-TW"/>
         </w:rPr>
-        <w:t>膽汁</w:t>
       </w:r>
       <w:r>
         <w:rPr>
           <w:lang w:eastAsia="zh-TW"/>
         </w:rPr>
-        <w:t>。</w:t>
       </w:r>
       <w:r>
         <w:rPr>
@@ -248,7 +245,6 @@
         <w:rPr>
           <w:lang w:eastAsia="zh-TW"/>
         </w:rPr>
-        <w:t>本教學模型設定消化液 Y 是</w:t>
       </w:r>
       <w:r>
         <w:rPr>
@@ -262,7 +258,7 @@
         <w:rPr>
           <w:lang w:eastAsia="zh-TW"/>
         </w:rPr>
-        <w:t>，含有</w:t>
+        <w:t>含有</w:t>
       </w:r>
       <w:r>
         <w:rPr>
@@ -416,7 +412,7 @@
                     <pic:cNvPicPr/>
                   </pic:nvPicPr>
                   <pic:blipFill>
-                    <a:blip r:embed="rId18"/>
+                    <a:blip r:embed="rId16"/>
                     <a:stretch>
                       <a:fillRect/>
                     </a:stretch>
@@ -455,7 +451,7 @@
       <w:r>
         <w:drawing>
           <wp:inline xmlns:a="http://schemas.openxmlformats.org/drawingml/2006/main" xmlns:pic="http://schemas.openxmlformats.org/drawingml/2006/picture">
-            <wp:extent cx="5760000" cy="1152000"/>
+            <wp:extent cx="5760000" cy="1382400"/>
             <wp:docPr id="1" name="Picture 1"/>
             <wp:cNvGraphicFramePr>
               <a:graphicFrameLocks noChangeAspect="1"/>
@@ -476,7 +472,7 @@
                   <pic:spPr>
                     <a:xfrm>
                       <a:off x="0" y="0"/>
-                      <a:ext cx="5760000" cy="1152000"/>
+                      <a:ext cx="5760000" cy="1382400"/>
                     </a:xfrm>
                     <a:prstGeom prst="rect"/>
                   </pic:spPr>
@@ -510,7 +506,15 @@
       </w:pPr>
       <w:r>
         <w:rPr/>
-        <w:t>1. 辨識實驗變量：每列可選多於一項。</w:t>
+        <w:t>1. 辨識實驗變量</w:t>
+      </w:r>
+    </w:p>
+    <w:p>
+      <w:r>
+        <w:rPr>
+          <w:sz w:val="24"/>
+        </w:rPr>
+        <w:t>在每列剔選適當的因素；每類可選多於一項。</w:t>
       </w:r>
     </w:p>
     <w:p>
@@ -530,13 +534,35 @@
         <w:tblLook w:firstColumn="1" w:firstRow="1" w:lastColumn="0" w:lastRow="0" w:noHBand="0" w:noVBand="1" w:val="04A0"/>
       </w:tblPr>
       <w:tblGrid>
-        <w:gridCol w:w="1701"/>
-        <w:gridCol w:w="8504"/>
+        <w:gridCol w:w="2268"/>
+        <w:gridCol w:w="7937"/>
       </w:tblGrid>
       <w:tr>
         <w:tc>
           <w:tcPr>
-            <w:tcW w:type="dxa" w:w="1701"/>
+            <w:tcW w:type="dxa" w:w="5103"/>
+          </w:tcPr>
+          <w:p>
+            <w:r>
+              <w:t>變量類別</w:t>
+            </w:r>
+          </w:p>
+        </w:tc>
+        <w:tc>
+          <w:tcPr>
+            <w:tcW w:type="dxa" w:w="5103"/>
+          </w:tcPr>
+          <w:p>
+            <w:r>
+              <w:t>可選因素</w:t>
+            </w:r>
+          </w:p>
+        </w:tc>
+      </w:tr>
+      <w:tr>
+        <w:tc>
+          <w:tcPr>
+            <w:tcW w:type="dxa" w:w="2268"/>
           </w:tcPr>
           <w:p>
             <w:pPr>
@@ -549,11 +575,15 @@
               </w:rPr>
               <w:t>獨立變量</w:t>
             </w:r>
+            <w:r>
+              <w:br/>
+              <w:t>主動改變的因素</w:t>
+            </w:r>
           </w:p>
         </w:tc>
         <w:tc>
           <w:tcPr>
-            <w:tcW w:type="dxa" w:w="8504"/>
+            <w:tcW w:type="dxa" w:w="7937"/>
           </w:tcPr>
           <w:p>
             <w:pPr>
@@ -563,37 +593,38 @@
               <w:rPr>
                 <w:sz w:val="24"/>
               </w:rPr>
-              <w:t>油和水總體積</w:t>
+              <w:t>□ 油和水總體積</w:t>
             </w:r>
             <w:r>
               <w:rPr>
                 <w:sz w:val="24"/>
               </w:rPr>
-              <w:t xml:space="preserve"> ／ 反應溫度</w:t>
+              <w:t xml:space="preserve">  □ 反應溫度</w:t>
             </w:r>
             <w:r>
               <w:rPr>
                 <w:sz w:val="24"/>
               </w:rPr>
-              <w:t xml:space="preserve"> ／ 反應時間</w:t>
+              <w:t xml:space="preserve">  □ 反應時間</w:t>
             </w:r>
             <w:r>
               <w:rPr>
                 <w:sz w:val="24"/>
               </w:rPr>
-              <w:t xml:space="preserve"> ／ 加液總量</w:t>
+              <w:br/>
+              <w:t>□ 加液總量</w:t>
             </w:r>
             <w:r>
               <w:rPr>
                 <w:sz w:val="24"/>
               </w:rPr>
-              <w:t xml:space="preserve"> ／ 搖勻方式</w:t>
+              <w:t xml:space="preserve">  □ 搖勻方式</w:t>
             </w:r>
             <w:r>
               <w:rPr>
                 <w:sz w:val="24"/>
               </w:rPr>
-              <w:t xml:space="preserve"> ／ 混合物外觀</w:t>
+              <w:t xml:space="preserve">  □ 混合物外觀</w:t>
             </w:r>
             <w:r>
               <w:rPr>
@@ -602,7 +633,7 @@
                 <w:sz w:val="24"/>
                 <w:u w:val="single"/>
               </w:rPr>
-              <w:t xml:space="preserve"> ／ 消化液組合</w:t>
+              <w:t xml:space="preserve">  ☑ 消化液組合</w:t>
             </w:r>
           </w:p>
         </w:tc>
@@ -610,7 +641,7 @@
       <w:tr>
         <w:tc>
           <w:tcPr>
-            <w:tcW w:type="dxa" w:w="1701"/>
+            <w:tcW w:type="dxa" w:w="2268"/>
           </w:tcPr>
           <w:p>
             <w:pPr>
@@ -623,11 +654,15 @@
               </w:rPr>
               <w:t>因變量</w:t>
             </w:r>
+            <w:r>
+              <w:br/>
+              <w:t>量度或觀察的結果</w:t>
+            </w:r>
           </w:p>
         </w:tc>
         <w:tc>
           <w:tcPr>
-            <w:tcW w:type="dxa" w:w="8504"/>
+            <w:tcW w:type="dxa" w:w="7937"/>
           </w:tcPr>
           <w:p>
             <w:pPr>
@@ -637,31 +672,32 @@
               <w:rPr>
                 <w:sz w:val="24"/>
               </w:rPr>
-              <w:t>油和水總體積</w:t>
+              <w:t>□ 油和水總體積</w:t>
             </w:r>
             <w:r>
               <w:rPr>
                 <w:sz w:val="24"/>
               </w:rPr>
-              <w:t xml:space="preserve"> ／ 反應溫度</w:t>
+              <w:t xml:space="preserve">  □ 反應溫度</w:t>
             </w:r>
             <w:r>
               <w:rPr>
                 <w:sz w:val="24"/>
               </w:rPr>
-              <w:t xml:space="preserve"> ／ 反應時間</w:t>
+              <w:t xml:space="preserve">  □ 反應時間</w:t>
             </w:r>
             <w:r>
               <w:rPr>
                 <w:sz w:val="24"/>
               </w:rPr>
-              <w:t xml:space="preserve"> ／ 加液總量</w:t>
+              <w:br/>
+              <w:t>□ 加液總量</w:t>
             </w:r>
             <w:r>
               <w:rPr>
                 <w:sz w:val="24"/>
               </w:rPr>
-              <w:t xml:space="preserve"> ／ 搖勻方式</w:t>
+              <w:t xml:space="preserve">  □ 搖勻方式</w:t>
             </w:r>
             <w:r>
               <w:rPr>
@@ -670,13 +706,13 @@
                 <w:sz w:val="24"/>
                 <w:u w:val="single"/>
               </w:rPr>
-              <w:t xml:space="preserve"> ／ 混合物外觀</w:t>
+              <w:t xml:space="preserve">  ☑ 混合物外觀</w:t>
             </w:r>
             <w:r>
               <w:rPr>
                 <w:sz w:val="24"/>
               </w:rPr>
-              <w:t xml:space="preserve"> ／ 消化液組合</w:t>
+              <w:t xml:space="preserve">  □ 消化液組合</w:t>
             </w:r>
           </w:p>
         </w:tc>
@@ -684,7 +720,7 @@
       <w:tr>
         <w:tc>
           <w:tcPr>
-            <w:tcW w:type="dxa" w:w="1701"/>
+            <w:tcW w:type="dxa" w:w="2268"/>
           </w:tcPr>
           <w:p>
             <w:pPr>
@@ -697,11 +733,15 @@
               </w:rPr>
               <w:t>控制變量</w:t>
             </w:r>
+            <w:r>
+              <w:br/>
+              <w:t>保持不變的因素</w:t>
+            </w:r>
           </w:p>
         </w:tc>
         <w:tc>
           <w:tcPr>
-            <w:tcW w:type="dxa" w:w="8504"/>
+            <w:tcW w:type="dxa" w:w="7937"/>
           </w:tcPr>
           <w:p>
             <w:pPr>
@@ -714,7 +754,7 @@
                 <w:sz w:val="24"/>
                 <w:u w:val="single"/>
               </w:rPr>
-              <w:t>油和水總體積</w:t>
+              <w:t>☑ 油和水總體積</w:t>
             </w:r>
             <w:r>
               <w:rPr>
@@ -723,7 +763,7 @@
                 <w:sz w:val="24"/>
                 <w:u w:val="single"/>
               </w:rPr>
-              <w:t xml:space="preserve"> ／ 反應溫度</w:t>
+              <w:t xml:space="preserve">  ☑ 反應溫度</w:t>
             </w:r>
             <w:r>
               <w:rPr>
@@ -732,7 +772,7 @@
                 <w:sz w:val="24"/>
                 <w:u w:val="single"/>
               </w:rPr>
-              <w:t xml:space="preserve"> ／ 反應時間</w:t>
+              <w:t xml:space="preserve">  ☑ 反應時間</w:t>
             </w:r>
             <w:r>
               <w:rPr>
@@ -741,7 +781,8 @@
                 <w:sz w:val="24"/>
                 <w:u w:val="single"/>
               </w:rPr>
-              <w:t xml:space="preserve"> ／ 加液總量</w:t>
+              <w:br/>
+              <w:t>☑ 加液總量</w:t>
             </w:r>
             <w:r>
               <w:rPr>
@@ -750,19 +791,19 @@
                 <w:sz w:val="24"/>
                 <w:u w:val="single"/>
               </w:rPr>
-              <w:t xml:space="preserve"> ／ 搖勻方式</w:t>
+              <w:t xml:space="preserve">  ☑ 搖勻方式</w:t>
             </w:r>
             <w:r>
               <w:rPr>
                 <w:sz w:val="24"/>
               </w:rPr>
-              <w:t xml:space="preserve"> ／ 混合物外觀</w:t>
+              <w:t xml:space="preserve">  □ 混合物外觀</w:t>
             </w:r>
             <w:r>
               <w:rPr>
                 <w:sz w:val="24"/>
               </w:rPr>
-              <w:t xml:space="preserve"> ／ 消化液組合</w:t>
+              <w:t xml:space="preserve">  □ 消化液組合</w:t>
             </w:r>
           </w:p>
         </w:tc>
@@ -774,7 +815,7 @@
       </w:pPr>
       <w:r>
         <w:rPr/>
-        <w:t>2. 選出公平比較所需的前提（可多選）</w:t>
+        <w:t>2. 選出公平比較所需的前提（可選多於一項）</w:t>
       </w:r>
     </w:p>
     <w:p>
@@ -793,27 +834,7 @@
           <w:color w:val="145DA0"/>
           <w:sz w:val="24"/>
         </w:rPr>
-        <w:t>☑ 各裝置在相同反應時間後觀察。</w:t>
-      </w:r>
-    </w:p>
-    <w:p>
-      <w:r>
-        <w:rPr>
-          <w:b/>
-          <w:color w:val="145DA0"/>
-          <w:sz w:val="24"/>
-        </w:rPr>
-        <w:t>☑ 各裝置起始油水量及加入液體的總量相同。</w:t>
-      </w:r>
-    </w:p>
-    <w:p>
-      <w:r>
-        <w:rPr>
-          <w:b/>
-          <w:color w:val="145DA0"/>
-          <w:sz w:val="24"/>
-        </w:rPr>
-        <w:t>☑ 各裝置使用相同搖勻方式。</w:t>
+        <w:t>☑ 各組起始油量及水量相同，加入液體的總量也相同。</w:t>
       </w:r>
     </w:p>
     <w:p>
@@ -825,12 +846,33 @@
       </w:r>
     </w:p>
     <w:p>
+      <w:r>
+        <w:rPr>
+          <w:b/>
+          <w:color w:val="145DA0"/>
+          <w:sz w:val="24"/>
+        </w:rPr>
+        <w:t>☑ 各組使用相同搖勻方式。</w:t>
+      </w:r>
+    </w:p>
+    <w:p>
+      <w:r>
+        <w:rPr>
+          <w:b/>
+          <w:color w:val="145DA0"/>
+          <w:sz w:val="24"/>
+        </w:rPr>
+        <w:t>☑ 各組在相同反應時間後觀察。</w:t>
+      </w:r>
+    </w:p>
+    <w:p>
       <w:pPr>
-        <w:pStyle w:val="Heading1"/>
+        <w:pStyle w:val="Heading2"/>
         <w:pageBreakBefore/>
       </w:pPr>
       <w:r>
-        <w:t>部分 1｜運用概念分析 X、Y 的個別作用</w:t>
+        <w:rPr/>
+        <w:t>3. 探究的對照組</w:t>
       </w:r>
     </w:p>
     <w:p>
@@ -838,7 +880,43 @@
         <w:rPr>
           <w:sz w:val="24"/>
         </w:rPr>
-        <w:t>兩組均為加入消化液並搖勻後一小時的模擬結果。</w:t>
+        <w:t>你認為此實驗需要對照組嗎？如需要，你會如何設計比較裝置？</w:t>
+      </w:r>
+    </w:p>
+    <w:p>
+      <w:r>
+        <w:rPr>
+          <w:color w:val="658087"/>
+          <w:sz w:val="22"/>
+        </w:rPr>
+        <w:t>（提示：對照組主要功能是作為比較的基準，用來確認實驗中的改變是由獨立變量所引起，而非其他外在因素的干擾，因此對照組不包含獨立變量的處理條件）</w:t>
+      </w:r>
+    </w:p>
+    <w:p>
+      <w:r>
+        <w:rPr>
+          <w:b/>
+          <w:color w:val="145DA0"/>
+          <w:sz w:val="24"/>
+        </w:rPr>
+        <w:t>可另設相同油水混合物加2 mL水作比較基準，與X或Y組比較；保持起始油水量、加液量、溫度、時間及搖勻方式相同。</w:t>
+      </w:r>
+    </w:p>
+    <w:p>
+      <w:pPr>
+        <w:pStyle w:val="Heading2"/>
+      </w:pPr>
+      <w:r>
+        <w:rPr/>
+        <w:t>部分 2.1｜分析 X、Y 的個別作用</w:t>
+      </w:r>
+    </w:p>
+    <w:p>
+      <w:r>
+        <w:rPr>
+          <w:sz w:val="24"/>
+        </w:rPr>
+        <w:t>以下為搖勻後一小時的模擬結果。</w:t>
       </w:r>
     </w:p>
     <w:p>
@@ -885,7 +963,8 @@
         <w:pStyle w:val="Heading2"/>
       </w:pPr>
       <w:r>
-        <w:t>運用乳化與表面積概念，分析 X 如何幫助 Y。</w:t>
+        <w:rPr/>
+        <w:t>4. 消化液 X 有甚麼作用？</w:t>
       </w:r>
     </w:p>
     <w:p>
@@ -893,7 +972,27 @@
         <w:rPr>
           <w:sz w:val="24"/>
         </w:rPr>
-        <w:t>研究員重新準備兩支試管，先加 X 或等量水並搖勻，再加入相同量的 Y；兩組的預處理時間相同。</w:t>
+      </w:r>
+      <w:r>
+        <w:rPr>
+          <w:sz w:val="24"/>
+        </w:rPr>
+        <w:t>消化液 X 最主要使脂質變成 （</w:t>
+      </w:r>
+      <w:r>
+        <w:rPr>
+          <w:b/>
+          <w:color w:val="145DA0"/>
+          <w:sz w:val="24"/>
+          <w:u w:val="single"/>
+        </w:rPr>
+        <w:t>混濁乳狀液</w:t>
+      </w:r>
+      <w:r>
+        <w:rPr>
+          <w:sz w:val="24"/>
+        </w:rPr>
+        <w:t xml:space="preserve"> ／ 清澈溶液）。</w:t>
       </w:r>
     </w:p>
     <w:p>
@@ -902,7 +1001,7 @@
       </w:pPr>
       <w:r>
         <w:rPr/>
-        <w:t>部分 2｜延伸一：X 如何幫助 Y？</w:t>
+        <w:t>部分 2.2｜分析 X 如何有助 Y 作用</w:t>
       </w:r>
     </w:p>
     <w:p>
@@ -910,7 +1009,7 @@
         <w:rPr>
           <w:sz w:val="24"/>
         </w:rPr>
-        <w:t>以下為加入 Y 後一小時的模擬結果。</w:t>
+        <w:t>研究員用兩支新試管，先加1 mL X或水並同樣搖勻，再各加1 mL Y，比較一小時後外觀。</w:t>
       </w:r>
     </w:p>
     <w:p>
@@ -958,7 +1057,7 @@
       </w:pPr>
       <w:r>
         <w:rPr/>
-        <w:t>3. X 如何有助其後 Y 的作用？</w:t>
+        <w:t>5. 消化液 X 如何有助消化液 Y 作用？</w:t>
       </w:r>
     </w:p>
     <w:p>
@@ -966,7 +1065,45 @@
         <w:rPr>
           <w:sz w:val="24"/>
         </w:rPr>
-        <w:t>X 先把大油滴分散成小油滴，令同量脂質的總表面積：</w:t>
+      </w:r>
+      <w:r>
+        <w:rPr>
+          <w:sz w:val="24"/>
+        </w:rPr>
+        <w:t>消化液 X 先把大油滴分散成小油滴，令總表面積 （</w:t>
+      </w:r>
+      <w:r>
+        <w:rPr>
+          <w:b/>
+          <w:color w:val="145DA0"/>
+          <w:sz w:val="24"/>
+          <w:u w:val="single"/>
+        </w:rPr>
+        <w:t>增加</w:t>
+      </w:r>
+      <w:r>
+        <w:rPr>
+          <w:sz w:val="24"/>
+        </w:rPr>
+        <w:t xml:space="preserve"> ／ 減少），有助消化液 Y 作用。</w:t>
+      </w:r>
+    </w:p>
+    <w:p>
+      <w:pPr>
+        <w:pStyle w:val="Heading2"/>
+        <w:pageBreakBefore/>
+      </w:pPr>
+      <w:r>
+        <w:rPr/>
+        <w:t>6. 本實驗能告訴我們甚麼？</w:t>
+      </w:r>
+    </w:p>
+    <w:p>
+      <w:r>
+        <w:rPr>
+          <w:sz w:val="24"/>
+        </w:rPr>
+        <w:t>我們只觀察油層、混濁或清澈的外觀，沒有檢測消化產物。以下哪個說法最恰當？</w:t>
       </w:r>
     </w:p>
     <w:p>
@@ -976,7 +1113,7 @@
           <w:color w:val="145DA0"/>
           <w:sz w:val="24"/>
         </w:rPr>
-        <w:t>☑ 增加</w:t>
+        <w:t>A. 外觀可提供消化液作用的線索，但不能單獨證明已產生甘油和脂肪酸。</w:t>
       </w:r>
     </w:p>
     <w:p>
@@ -984,17 +1121,7 @@
         <w:rPr>
           <w:sz w:val="24"/>
         </w:rPr>
-        <w:t>□ 減少</w:t>
-      </w:r>
-    </w:p>
-    <w:p>
-      <w:pPr>
-        <w:pStyle w:val="Heading1"/>
-        <w:pageBreakBefore/>
-      </w:pPr>
-      <w:r>
-        <w:rPr/>
-        <w:t>部分 2｜延伸一：接續分析</w:t>
+        <w:t>B. 只要混合物清澈，就已完全證明脂質分解成甘油和脂肪酸。</w:t>
       </w:r>
     </w:p>
     <w:p>
@@ -1003,17 +1130,7 @@
       </w:pPr>
       <w:r>
         <w:rPr/>
-        <w:t>4. 外觀能告訴我們甚麼？</w:t>
-      </w:r>
-    </w:p>
-    <w:p>
-      <w:r>
-        <w:rPr>
-          <w:b/>
-          <w:color w:val="145DA0"/>
-          <w:sz w:val="24"/>
-        </w:rPr>
-        <w:t>☑ 外觀可提供消化液作用的線索，但不能單獨證明已產生甘油和脂肪酸。</w:t>
+        <w:t>部分 2.3｜加熱對消化液作用的影響</w:t>
       </w:r>
     </w:p>
     <w:p>
@@ -1021,24 +1138,7 @@
         <w:rPr>
           <w:sz w:val="24"/>
         </w:rPr>
-        <w:t>□ 只要油層消失，就已完全證明脂質分解成甘油和脂肪酸。</w:t>
-      </w:r>
-    </w:p>
-    <w:p>
-      <w:pPr>
-        <w:pStyle w:val="Heading2"/>
-      </w:pPr>
-      <w:r>
-        <w:rPr/>
-        <w:t>部分 3｜延伸二：煮沸的影響</w:t>
-      </w:r>
-    </w:p>
-    <w:p>
-      <w:r>
-        <w:rPr>
-          <w:sz w:val="24"/>
-        </w:rPr>
-        <w:t>研究員以延伸一的未煮沸 X 後加 Y 組為比較基準。每次只煮沸一種液體，冷卻至 37°C，按相同次序各加 1 mL X、Y；觀察一小時後結果。</w:t>
+        <w:t>以未煮沸X後加Y組為比較基準。每次只煮沸其中一種，冷卻至37°C後按同樣次序各加1 mL X、Y，比較一小時後結果。</w:t>
       </w:r>
     </w:p>
     <w:p>
@@ -1048,7 +1148,7 @@
       <w:r>
         <w:drawing>
           <wp:inline xmlns:a="http://schemas.openxmlformats.org/drawingml/2006/main" xmlns:pic="http://schemas.openxmlformats.org/drawingml/2006/picture">
-            <wp:extent cx="5760000" cy="1536000"/>
+            <wp:extent cx="6480000" cy="2073600"/>
             <wp:docPr id="4" name="Picture 4"/>
             <wp:cNvGraphicFramePr>
               <a:graphicFrameLocks noChangeAspect="1"/>
@@ -1069,7 +1169,7 @@
                   <pic:spPr>
                     <a:xfrm>
                       <a:off x="0" y="0"/>
-                      <a:ext cx="5760000" cy="1536000"/>
+                      <a:ext cx="6480000" cy="2073600"/>
                     </a:xfrm>
                     <a:prstGeom prst="rect"/>
                   </pic:spPr>
@@ -1086,7 +1186,7 @@
       </w:pPr>
       <w:r>
         <w:rPr/>
-        <w:t>5. 煮沸後失去作用的消化液</w:t>
+        <w:t>7. 延伸結論</w:t>
       </w:r>
     </w:p>
     <w:p>
@@ -1094,17 +1194,27 @@
         <w:rPr>
           <w:sz w:val="24"/>
         </w:rPr>
-        <w:t>□ 消化液 X</w:t>
       </w:r>
-    </w:p>
-    <w:p>
+      <w:r>
+        <w:rPr>
+          <w:sz w:val="24"/>
+        </w:rPr>
+        <w:t xml:space="preserve">被煮沸後失去作用的消化液是（消化液 X ／ </w:t>
+      </w:r>
       <w:r>
         <w:rPr>
           <w:b/>
           <w:color w:val="145DA0"/>
           <w:sz w:val="24"/>
+          <w:u w:val="single"/>
         </w:rPr>
-        <w:t>☑ 消化液 Y</w:t>
+        <w:t>消化液 Y</w:t>
+      </w:r>
+      <w:r>
+        <w:rPr>
+          <w:sz w:val="24"/>
+        </w:rPr>
+        <w:t>）。</w:t>
       </w:r>
     </w:p>
     <w:p>
@@ -1113,7 +1223,7 @@
       </w:pPr>
       <w:r>
         <w:rPr/>
-        <w:t>整合解釋</w:t>
+        <w:t>部分 3｜整合解釋</w:t>
       </w:r>
     </w:p>
     <w:p>
@@ -1121,7 +1231,7 @@
         <w:rPr>
           <w:sz w:val="24"/>
         </w:rPr>
-        <w:t>6. 綜合實驗結果與課題需知，解釋膽汁與胰液中的脂肪酶如何共同幫助脂質消化，以及煮沸如何影響它們的作用。</w:t>
+        <w:t>8. 綜合實驗結果與課題需知，解釋膽汁與胰液中的脂肪酶如何共同幫助脂質消化，以及煮沸如何影響它們的作用。</w:t>
       </w:r>
     </w:p>
     <w:p>

</xml_diff>

<commit_message>
Remove redundant scenario annotation and variable abbreviation hint
</commit_message>
<xml_diff>
--- a/paperwork/generated/WS1_answers.docx
+++ b/paperwork/generated/WS1_answers.docx
@@ -515,15 +515,6 @@
           <w:sz w:val="24"/>
         </w:rPr>
         <w:t>在每列剔選適當的因素；每類可選多於一項。</w:t>
-      </w:r>
-    </w:p>
-    <w:p>
-      <w:r>
-        <w:rPr>
-          <w:color w:val="658087"/>
-          <w:sz w:val="22"/>
-        </w:rPr>
-        <w:t>IV（主動改變的因素）；DV（量度或觀察的結果）；CV（保持不變的因素）</w:t>
       </w:r>
     </w:p>
     <w:tbl>

</xml_diff>

<commit_message>
Simplify X-action wording and remove main-experiment result captions
</commit_message>
<xml_diff>
--- a/paperwork/generated/WS1_answers.docx
+++ b/paperwork/generated/WS1_answers.docx
@@ -968,7 +968,7 @@
         <w:rPr>
           <w:sz w:val="24"/>
         </w:rPr>
-        <w:t>消化液 X 最主要使脂質變成 （</w:t>
+        <w:t>消化液 X 使溶液變得（</w:t>
       </w:r>
       <w:r>
         <w:rPr>
@@ -977,13 +977,13 @@
           <w:sz w:val="24"/>
           <w:u w:val="single"/>
         </w:rPr>
-        <w:t>混濁乳狀液</w:t>
+        <w:t>混濁</w:t>
       </w:r>
       <w:r>
         <w:rPr>
           <w:sz w:val="24"/>
         </w:rPr>
-        <w:t xml:space="preserve"> ／ 清澈溶液）。</w:t>
+        <w:t xml:space="preserve"> ／ 清澈）。</w:t>
       </w:r>
     </w:p>
     <w:p>

</xml_diff>

<commit_message>
Revert "Simplify X-action wording and remove main-experiment result captions"
This reverts commit 0afbbfea4dec54e0aea33738cae76a5ea3694c53.
</commit_message>
<xml_diff>
--- a/paperwork/generated/WS1_answers.docx
+++ b/paperwork/generated/WS1_answers.docx
@@ -968,7 +968,7 @@
         <w:rPr>
           <w:sz w:val="24"/>
         </w:rPr>
-        <w:t>消化液 X 使溶液變得（</w:t>
+        <w:t>消化液 X 最主要使脂質變成 （</w:t>
       </w:r>
       <w:r>
         <w:rPr>
@@ -977,13 +977,13 @@
           <w:sz w:val="24"/>
           <w:u w:val="single"/>
         </w:rPr>
-        <w:t>混濁</w:t>
+        <w:t>混濁乳狀液</w:t>
       </w:r>
       <w:r>
         <w:rPr>
           <w:sz w:val="24"/>
         </w:rPr>
-        <w:t xml:space="preserve"> ／ 清澈）。</w:t>
+        <w:t xml:space="preserve"> ／ 清澈溶液）。</w:t>
       </w:r>
     </w:p>
     <w:p>

</xml_diff>

<commit_message>
Remove requested hydrolysis note and redundant fatty acid captions
</commit_message>
<xml_diff>
--- a/paperwork/generated/WS1_answers.docx
+++ b/paperwork/generated/WS1_answers.docx
@@ -300,7 +300,7 @@
         <w:rPr>
           <w:lang w:eastAsia="zh-TW"/>
         </w:rPr>
-        <w:t>；本課以完全水解的簡化模型，表示</w:t>
+        <w:t>。</w:t>
       </w:r>
       <w:r>
         <w:rPr>
@@ -308,13 +308,11 @@
           <w:color w:val="B7312C"/>
           <w:lang w:eastAsia="zh-TW"/>
         </w:rPr>
-        <w:t>甘油三酯</w:t>
       </w:r>
       <w:r>
         <w:rPr>
           <w:lang w:eastAsia="zh-TW"/>
         </w:rPr>
-        <w:t>分解為</w:t>
       </w:r>
       <w:r>
         <w:rPr>
@@ -322,13 +320,11 @@
           <w:color w:val="B7312C"/>
           <w:lang w:eastAsia="zh-TW"/>
         </w:rPr>
-        <w:t>甘油</w:t>
       </w:r>
       <w:r>
         <w:rPr>
           <w:lang w:eastAsia="zh-TW"/>
         </w:rPr>
-        <w:t>與</w:t>
       </w:r>
       <w:r>
         <w:rPr>
@@ -336,13 +332,11 @@
           <w:color w:val="B7312C"/>
           <w:lang w:eastAsia="zh-TW"/>
         </w:rPr>
-        <w:t>脂肪酸</w:t>
       </w:r>
       <w:r>
         <w:rPr>
           <w:lang w:eastAsia="zh-TW"/>
         </w:rPr>
-        <w:t>，以助吸收。</w:t>
       </w:r>
       <w:r>
         <w:rPr>

</xml_diff>